<commit_message>
Add ATS preview and resume quality guard
</commit_message>
<xml_diff>
--- a/exports/generated_resume.docx
+++ b/exports/generated_resume.docx
@@ -36,7 +36,7 @@
           <w:b/>
           <w:sz w:val="20"/>
         </w:rPr>
-        <w:t>Junior AI Engineer</w:t>
+        <w:t>Junior AI/ML Engineer</w:t>
       </w:r>
     </w:p>
     <w:p>
@@ -59,7 +59,7 @@
         <w:rPr>
           <w:sz w:val="20"/>
         </w:rPr>
-        <w:t>New graduate Computer Engineer focused on AI, machine learning, and data-driven applications. Experienced in building Streamlit-based data products, machine learning prototypes, and YOLO-based computer vision models using custom datasets.</w:t>
+        <w:t>New graduate Computer Engineer focused on AI, machine learning, and data-driven applications. Experienced in building Streamlit-based ML prototypes, data preprocessing workflows, and YOLO-based computer vision models using custom datasets.</w:t>
       </w:r>
     </w:p>
     <w:p>

</xml_diff>

<commit_message>
lots of things changed :/
</commit_message>
<xml_diff>
--- a/exports/generated_resume.docx
+++ b/exports/generated_resume.docx
@@ -204,20 +204,7 @@
         <w:rPr>
           <w:sz w:val="20"/>
         </w:rPr>
-        <w:t>Managed bounding box annotation workflows for object detection model training.</w:t>
-      </w:r>
-    </w:p>
-    <w:p>
-      <w:pPr>
-        <w:pStyle w:val="ListBullet"/>
-        <w:spacing w:after="20"/>
-        <w:ind w:left="259" w:hanging="259"/>
-      </w:pPr>
-      <w:r>
-        <w:rPr>
-          <w:sz w:val="20"/>
-        </w:rPr>
-        <w:t>Applied data augmentation techniques to improve robustness under different document conditions.</w:t>
+        <w:t>Applied data augmentation techniques to improve model robustness under different document conditions.</w:t>
       </w:r>
     </w:p>
     <w:p>
@@ -244,6 +231,45 @@
           <w:sz w:val="20"/>
         </w:rPr>
         <w:t>Collected and annotated a custom dataset for detecting GD&amp;T symbols in technical engineering drawings.</w:t>
+      </w:r>
+    </w:p>
+    <w:p>
+      <w:pPr>
+        <w:pStyle w:val="ListBullet"/>
+        <w:spacing w:after="20"/>
+        <w:ind w:left="259" w:hanging="259"/>
+      </w:pPr>
+      <w:r>
+        <w:rPr>
+          <w:sz w:val="20"/>
+        </w:rPr>
+        <w:t>Managed bounding box annotation workflows for object detection model training.</w:t>
+      </w:r>
+    </w:p>
+    <w:p>
+      <w:pPr>
+        <w:pStyle w:val="ListBullet"/>
+        <w:spacing w:after="20"/>
+        <w:ind w:left="259" w:hanging="259"/>
+      </w:pPr>
+      <w:r>
+        <w:rPr>
+          <w:sz w:val="20"/>
+        </w:rPr>
+        <w:t>Worked on small-object detection challenges in noisy engineering drawing documents.</w:t>
+      </w:r>
+    </w:p>
+    <w:p>
+      <w:pPr>
+        <w:pStyle w:val="ListBullet"/>
+        <w:spacing w:after="20"/>
+        <w:ind w:left="259" w:hanging="259"/>
+      </w:pPr>
+      <w:r>
+        <w:rPr>
+          <w:sz w:val="20"/>
+        </w:rPr>
+        <w:t>Contributed to an end-to-end computer vision workflow covering dataset preparation, annotation, augmentation, model training, and result review.</w:t>
       </w:r>
     </w:p>
     <w:p>
@@ -313,7 +339,7 @@
         <w:rPr>
           <w:sz w:val="20"/>
         </w:rPr>
-        <w:t>Integrated classification and regression workflows using scikit-learn with standard preprocessing steps.</w:t>
+        <w:t>Implemented support for CSV, TSV, Excel, and JSON file ingestion with automatic column type inference.</w:t>
       </w:r>
     </w:p>
     <w:p>
@@ -326,7 +352,7 @@
         <w:rPr>
           <w:sz w:val="20"/>
         </w:rPr>
-        <w:t>Implemented support for CSV, TSV, Excel, and JSON file ingestion with automatic column type inference.</w:t>
+        <w:t>Integrated classification and regression workflows using scikit-learn with standard preprocessing steps.</w:t>
       </w:r>
     </w:p>
     <w:p>
@@ -371,7 +397,91 @@
         <w:rPr>
           <w:sz w:val="20"/>
         </w:rPr>
+        <w:t>Used a Hugging Face-based language model to generate personalized analysis text.</w:t>
+      </w:r>
+    </w:p>
+    <w:p>
+      <w:pPr>
+        <w:pStyle w:val="ListBullet"/>
+        <w:spacing w:after="20"/>
+        <w:ind w:left="259" w:hanging="259"/>
+      </w:pPr>
+      <w:r>
+        <w:rPr>
+          <w:sz w:val="20"/>
+        </w:rPr>
         <w:t>Integrated Supabase for user session tracking and result storage.</w:t>
+      </w:r>
+    </w:p>
+    <w:p>
+      <w:pPr>
+        <w:spacing w:before="80" w:after="0"/>
+      </w:pPr>
+      <w:r>
+        <w:rPr>
+          <w:b/>
+          <w:sz w:val="20"/>
+        </w:rPr>
+        <w:t>ApplyForge - ATS-Friendly Resume Builder</w:t>
+      </w:r>
+      <w:r>
+        <w:rPr>
+          <w:i/>
+          <w:sz w:val="20"/>
+        </w:rPr>
+        <w:t xml:space="preserve"> | Python, Streamlit, python-docx, Jinja2, ATS, NLP</w:t>
+      </w:r>
+    </w:p>
+    <w:p>
+      <w:pPr>
+        <w:pStyle w:val="ListBullet"/>
+        <w:spacing w:after="20"/>
+        <w:ind w:left="259" w:hanging="259"/>
+      </w:pPr>
+      <w:r>
+        <w:rPr>
+          <w:sz w:val="20"/>
+        </w:rPr>
+        <w:t>Implemented synonym-aware skill matching to map job description aliases such as ML, sklearn, data wrangling, and dashboards to canonical resume skills.</w:t>
+      </w:r>
+    </w:p>
+    <w:p>
+      <w:pPr>
+        <w:pStyle w:val="ListBullet"/>
+        <w:spacing w:after="20"/>
+        <w:ind w:left="259" w:hanging="259"/>
+      </w:pPr>
+      <w:r>
+        <w:rPr>
+          <w:sz w:val="20"/>
+        </w:rPr>
+        <w:t>Built a Streamlit-based ATS-friendly resume builder that analyzes job descriptions and generates tailored resume drafts from structured candidate profile data.</w:t>
+      </w:r>
+    </w:p>
+    <w:p>
+      <w:pPr>
+        <w:pStyle w:val="ListBullet"/>
+        <w:spacing w:after="20"/>
+        <w:ind w:left="259" w:hanging="259"/>
+      </w:pPr>
+      <w:r>
+        <w:rPr>
+          <w:sz w:val="20"/>
+        </w:rPr>
+        <w:t>Developed role-specific resume generation modes for AI/ML Engineer, Data Scientist, Data Analyst, Computer Vision, and Python/Data Developer profiles.</w:t>
+      </w:r>
+    </w:p>
+    <w:p>
+      <w:pPr>
+        <w:pStyle w:val="ListBullet"/>
+        <w:spacing w:after="20"/>
+        <w:ind w:left="259" w:hanging="259"/>
+      </w:pPr>
+      <w:r>
+        <w:rPr>
+          <w:sz w:val="20"/>
+        </w:rPr>
+        <w:t>Added manual bullet selection, unsupported-claim filtering, and Strict, Balanced, and Compact generation modes to keep resume content controlled and evidence-based.</w:t>
       </w:r>
     </w:p>
     <w:p>

</xml_diff>

<commit_message>
Refine resume composition policy and remove weak project
</commit_message>
<xml_diff>
--- a/exports/generated_resume.docx
+++ b/exports/generated_resume.docx
@@ -36,7 +36,7 @@
           <w:b/>
           <w:sz w:val="20"/>
         </w:rPr>
-        <w:t>Junior AI/ML Engineer</w:t>
+        <w:t>Junior Python Developer - Data/AI Focused</w:t>
       </w:r>
     </w:p>
     <w:p>
@@ -59,7 +59,7 @@
         <w:rPr>
           <w:sz w:val="20"/>
         </w:rPr>
-        <w:t>New graduate Computer Engineer focused on AI, machine learning, and data-driven applications. Experienced in building Streamlit-based ML prototypes, data preprocessing workflows, and YOLO-based computer vision models using custom datasets.</w:t>
+        <w:t>New graduate Computer Engineer focused on Python-based data applications, Streamlit tools, and AI-assisted software development. Experienced in building data processing workflows, integrating backend services, and developing interactive ML/data prototypes.</w:t>
       </w:r>
     </w:p>
     <w:p>
@@ -101,6 +101,24 @@
           <w:b/>
           <w:sz w:val="20"/>
         </w:rPr>
+        <w:t xml:space="preserve">Tools: </w:t>
+      </w:r>
+      <w:r>
+        <w:rPr>
+          <w:sz w:val="20"/>
+        </w:rPr>
+        <w:t>Git, Streamlit, Supabase, Plotly</w:t>
+      </w:r>
+    </w:p>
+    <w:p>
+      <w:pPr>
+        <w:spacing w:after="20"/>
+      </w:pPr>
+      <w:r>
+        <w:rPr>
+          <w:b/>
+          <w:sz w:val="20"/>
+        </w:rPr>
         <w:t xml:space="preserve">Data &amp; ML: </w:t>
       </w:r>
       <w:r>
@@ -119,13 +137,13 @@
           <w:b/>
           <w:sz w:val="20"/>
         </w:rPr>
-        <w:t xml:space="preserve">Computer Vision: </w:t>
+        <w:t xml:space="preserve">AI Workflow: </w:t>
       </w:r>
       <w:r>
         <w:rPr>
           <w:sz w:val="20"/>
         </w:rPr>
-        <w:t>OpenCV, YOLO</w:t>
+        <w:t>Prompt Design, AI Coding Tools, LLM-based Development</w:t>
       </w:r>
     </w:p>
     <w:p>
@@ -137,31 +155,13 @@
           <w:b/>
           <w:sz w:val="20"/>
         </w:rPr>
-        <w:t xml:space="preserve">Tools: </w:t>
+        <w:t xml:space="preserve">Computer Vision: </w:t>
       </w:r>
       <w:r>
         <w:rPr>
           <w:sz w:val="20"/>
         </w:rPr>
-        <w:t>Git, Streamlit, Supabase, Plotly</w:t>
-      </w:r>
-    </w:p>
-    <w:p>
-      <w:pPr>
-        <w:spacing w:after="20"/>
-      </w:pPr>
-      <w:r>
-        <w:rPr>
-          <w:b/>
-          <w:sz w:val="20"/>
-        </w:rPr>
-        <w:t xml:space="preserve">AI Workflow: </w:t>
-      </w:r>
-      <w:r>
-        <w:rPr>
-          <w:sz w:val="20"/>
-        </w:rPr>
-        <w:t>Prompt Design, AI Coding Tools, LLM-based Development</w:t>
+        <w:t>OpenCV, YOLO</w:t>
       </w:r>
     </w:p>
     <w:p>
@@ -204,6 +204,19 @@
         <w:rPr>
           <w:sz w:val="20"/>
         </w:rPr>
+        <w:t>Managed bounding box annotation workflows for object detection model training.</w:t>
+      </w:r>
+    </w:p>
+    <w:p>
+      <w:pPr>
+        <w:pStyle w:val="ListBullet"/>
+        <w:spacing w:after="20"/>
+        <w:ind w:left="259" w:hanging="259"/>
+      </w:pPr>
+      <w:r>
+        <w:rPr>
+          <w:sz w:val="20"/>
+        </w:rPr>
         <w:t>Applied data augmentation techniques to improve model robustness under different document conditions.</w:t>
       </w:r>
     </w:p>
@@ -231,19 +244,6 @@
           <w:sz w:val="20"/>
         </w:rPr>
         <w:t>Collected and annotated a custom dataset for detecting GD&amp;T symbols in technical engineering drawings.</w:t>
-      </w:r>
-    </w:p>
-    <w:p>
-      <w:pPr>
-        <w:pStyle w:val="ListBullet"/>
-        <w:spacing w:after="20"/>
-        <w:ind w:left="259" w:hanging="259"/>
-      </w:pPr>
-      <w:r>
-        <w:rPr>
-          <w:sz w:val="20"/>
-        </w:rPr>
-        <w:t>Managed bounding box annotation workflows for object detection model training.</w:t>
       </w:r>
     </w:p>
     <w:p>
@@ -326,6 +326,19 @@
         <w:rPr>
           <w:sz w:val="20"/>
         </w:rPr>
+        <w:t>Implemented support for CSV, TSV, Excel, and JSON file ingestion with automatic column type inference.</w:t>
+      </w:r>
+    </w:p>
+    <w:p>
+      <w:pPr>
+        <w:pStyle w:val="ListBullet"/>
+        <w:spacing w:after="20"/>
+        <w:ind w:left="259" w:hanging="259"/>
+      </w:pPr>
+      <w:r>
+        <w:rPr>
+          <w:sz w:val="20"/>
+        </w:rPr>
         <w:t>Developed modular data cleaning tools for missing values, duplicates, outliers, and inconsistent values.</w:t>
       </w:r>
     </w:p>
@@ -339,78 +352,7 @@
         <w:rPr>
           <w:sz w:val="20"/>
         </w:rPr>
-        <w:t>Implemented support for CSV, TSV, Excel, and JSON file ingestion with automatic column type inference.</w:t>
-      </w:r>
-    </w:p>
-    <w:p>
-      <w:pPr>
-        <w:pStyle w:val="ListBullet"/>
-        <w:spacing w:after="20"/>
-        <w:ind w:left="259" w:hanging="259"/>
-      </w:pPr>
-      <w:r>
-        <w:rPr>
-          <w:sz w:val="20"/>
-        </w:rPr>
         <w:t>Integrated classification and regression workflows using scikit-learn with standard preprocessing steps.</w:t>
-      </w:r>
-    </w:p>
-    <w:p>
-      <w:pPr>
-        <w:spacing w:before="80" w:after="0"/>
-      </w:pPr>
-      <w:r>
-        <w:rPr>
-          <w:b/>
-          <w:sz w:val="20"/>
-        </w:rPr>
-        <w:t>AI-Powered Personality Analysis App</w:t>
-      </w:r>
-      <w:r>
-        <w:rPr>
-          <w:i/>
-          <w:sz w:val="20"/>
-        </w:rPr>
-        <w:t xml:space="preserve"> | Streamlit, Supabase, Hugging Face</w:t>
-      </w:r>
-    </w:p>
-    <w:p>
-      <w:pPr>
-        <w:pStyle w:val="ListBullet"/>
-        <w:spacing w:after="20"/>
-        <w:ind w:left="259" w:hanging="259"/>
-      </w:pPr>
-      <w:r>
-        <w:rPr>
-          <w:sz w:val="20"/>
-        </w:rPr>
-        <w:t>Developed a Streamlit application for Big Five-based personality analysis and MBTI-style inference.</w:t>
-      </w:r>
-    </w:p>
-    <w:p>
-      <w:pPr>
-        <w:pStyle w:val="ListBullet"/>
-        <w:spacing w:after="20"/>
-        <w:ind w:left="259" w:hanging="259"/>
-      </w:pPr>
-      <w:r>
-        <w:rPr>
-          <w:sz w:val="20"/>
-        </w:rPr>
-        <w:t>Used a Hugging Face-based language model to generate personalized analysis text.</w:t>
-      </w:r>
-    </w:p>
-    <w:p>
-      <w:pPr>
-        <w:pStyle w:val="ListBullet"/>
-        <w:spacing w:after="20"/>
-        <w:ind w:left="259" w:hanging="259"/>
-      </w:pPr>
-      <w:r>
-        <w:rPr>
-          <w:sz w:val="20"/>
-        </w:rPr>
-        <w:t>Integrated Supabase for user session tracking and result storage.</w:t>
       </w:r>
     </w:p>
     <w:p>
@@ -442,6 +384,19 @@
         <w:rPr>
           <w:sz w:val="20"/>
         </w:rPr>
+        <w:t>Built a Streamlit-based ATS-friendly resume builder that analyzes job descriptions and generates tailored resume drafts from structured candidate profile data.</w:t>
+      </w:r>
+    </w:p>
+    <w:p>
+      <w:pPr>
+        <w:pStyle w:val="ListBullet"/>
+        <w:spacing w:after="20"/>
+        <w:ind w:left="259" w:hanging="259"/>
+      </w:pPr>
+      <w:r>
+        <w:rPr>
+          <w:sz w:val="20"/>
+        </w:rPr>
         <w:t>Implemented synonym-aware skill matching to map job description aliases such as ML, sklearn, data wrangling, and dashboards to canonical resume skills.</w:t>
       </w:r>
     </w:p>
@@ -455,7 +410,7 @@
         <w:rPr>
           <w:sz w:val="20"/>
         </w:rPr>
-        <w:t>Built a Streamlit-based ATS-friendly resume builder that analyzes job descriptions and generates tailored resume drafts from structured candidate profile data.</w:t>
+        <w:t>Added manual bullet selection, unsupported-claim filtering, and Strict, Balanced, and Compact generation modes to keep resume content controlled and evidence-based.</w:t>
       </w:r>
     </w:p>
     <w:p>
@@ -481,7 +436,7 @@
         <w:rPr>
           <w:sz w:val="20"/>
         </w:rPr>
-        <w:t>Added manual bullet selection, unsupported-claim filtering, and Strict, Balanced, and Compact generation modes to keep resume content controlled and evidence-based.</w:t>
+        <w:t>Integrated Markdown and DOCX export with ATS text preview and resume quality diagnostics to validate generated resumes before application.</w:t>
       </w:r>
     </w:p>
     <w:p>

</xml_diff>